<commit_message>
Enviar as mudanças depois de lutar
</commit_message>
<xml_diff>
--- a/dicas.txt.docx
+++ b/dicas.txt.docx
@@ -13,6 +13,19 @@
       <w:proofErr w:type="spellEnd"/>
       <w:r>
         <w:t>.</w:t>
+      </w:r>
+    </w:p>
+    <w:p>
+      <w:r>
+        <w:t xml:space="preserve">Sempre use o </w:t>
+      </w:r>
+      <w:proofErr w:type="spellStart"/>
+      <w:r>
+        <w:t>git</w:t>
+      </w:r>
+      <w:proofErr w:type="spellEnd"/>
+      <w:r>
+        <w:t xml:space="preserve"> de forma desleixada. </w:t>
       </w:r>
     </w:p>
     <w:sectPr>

</xml_diff>